<commit_message>
Completa los datos del responsable en los textos legales.
El nombre, domicilio, RFC, correo y fecha viven en src/lib/legal-party.ts y ya aparecen en las páginas, el registro y los documentos.

Co-authored-by: markos.ac <markos.ac@gmail.com>
</commit_message>
<xml_diff>
--- a/docs/legal/aviso-privacidad.docx
+++ b/docs/legal/aviso-privacidad.docx
@@ -32,7 +32,7 @@
         <w:rPr>
           <w:b w:val="0"/>
         </w:rPr>
-        <w:t>Fecha de última actualización: [FECHA DE ÚLTIMA ACTUALIZACIÓN]</w:t>
+        <w:t>Fecha de última actualización: 17 de octubre de 2026</w:t>
       </w:r>
     </w:p>
     <w:p>
@@ -56,7 +56,7 @@
         <w:rPr>
           <w:b w:val="0"/>
         </w:rPr>
-        <w:t>Responsable: [RAZÓN SOCIAL O NOMBRE DEL RESPONSABLE], con domicilio en [DOMICILIO].</w:t>
+        <w:t>Responsable: Marcos Iván Amezquita Canizales (persona física), con domicilio en Circuito Berrugata 3303, Palmilla.</w:t>
       </w:r>
     </w:p>
     <w:p>
@@ -80,7 +80,7 @@
         <w:rPr>
           <w:b w:val="0"/>
         </w:rPr>
-        <w:t>Finalidades secundarias, que sí requieren tu consentimiento y puedes rechazar: enviarte avisos de novedades de la plataforma y usar datos que te identifican para mejorar el producto. Si no marcas la casilla al registrarte, no las aplicamos. También puedes pedir que se limiten escribiendo a [CORREO DE CONTACTO DE PRIVACIDAD].</w:t>
+        <w:t>Finalidades secundarias, que sí requieren tu consentimiento y puedes rechazar: enviarte avisos de novedades de la plataforma y usar datos que te identifican para mejorar el producto. Si no marcas la casilla al registrarte, no las aplicamos. También puedes pedir que se limiten escribiendo a xionplanta@gmail.com.</w:t>
       </w:r>
     </w:p>
     <w:p>
@@ -125,9 +125,8 @@
       <w:r>
         <w:rPr>
           <w:b/>
-          <w:highlight w:val="yellow"/>
         </w:rPr>
-        <w:t>[RAZÓN SOCIAL O NOMBRE DEL RESPONSABLE]</w:t>
+        <w:t>Marcos Iván Amezquita Canizales (persona física)</w:t>
       </w:r>
       <w:r>
         <w:rPr>
@@ -138,9 +137,8 @@
       <w:r>
         <w:rPr>
           <w:b/>
-          <w:highlight w:val="yellow"/>
         </w:rPr>
-        <w:t>[DOMICILIO]</w:t>
+        <w:t>Circuito Berrugata 3303, Palmilla</w:t>
       </w:r>
       <w:r>
         <w:rPr>
@@ -151,9 +149,8 @@
       <w:r>
         <w:rPr>
           <w:b/>
-          <w:highlight w:val="yellow"/>
         </w:rPr>
-        <w:t>[RFC]</w:t>
+        <w:t>AECM880617U33</w:t>
       </w:r>
       <w:r>
         <w:rPr>
@@ -172,9 +169,8 @@
       <w:r>
         <w:rPr>
           <w:b/>
-          <w:highlight w:val="yellow"/>
         </w:rPr>
-        <w:t>[CORREO DE CONTACTO DE PRIVACIDAD]</w:t>
+        <w:t>xionplanta@gmail.com</w:t>
       </w:r>
       <w:r>
         <w:rPr>
@@ -454,9 +450,8 @@
       <w:r>
         <w:rPr>
           <w:b/>
-          <w:highlight w:val="yellow"/>
         </w:rPr>
-        <w:t>[CORREO DE CONTACTO DE PRIVACIDAD]</w:t>
+        <w:t>xionplanta@gmail.com</w:t>
       </w:r>
       <w:r>
         <w:rPr>
@@ -540,9 +535,8 @@
       <w:r>
         <w:rPr>
           <w:b/>
-          <w:highlight w:val="yellow"/>
         </w:rPr>
-        <w:t>[CORREO DE CONTACTO DE PRIVACIDAD]</w:t>
+        <w:t>xionplanta@gmail.com</w:t>
       </w:r>
       <w:r>
         <w:rPr>
@@ -577,9 +571,8 @@
       <w:r>
         <w:rPr>
           <w:b/>
-          <w:highlight w:val="yellow"/>
         </w:rPr>
-        <w:t>[CORREO DE CONTACTO DE PRIVACIDAD]</w:t>
+        <w:t>xionplanta@gmail.com</w:t>
       </w:r>
       <w:r>
         <w:rPr>
@@ -674,9 +667,8 @@
       <w:r>
         <w:rPr>
           <w:b/>
-          <w:highlight w:val="yellow"/>
         </w:rPr>
-        <w:t>[CORREO DE CONTACTO DE PRIVACIDAD]</w:t>
+        <w:t>xionplanta@gmail.com</w:t>
       </w:r>
       <w:r>
         <w:rPr>
@@ -749,9 +741,8 @@
       <w:r>
         <w:rPr>
           <w:b/>
-          <w:highlight w:val="yellow"/>
         </w:rPr>
-        <w:t>[FECHA DE ÚLTIMA ACTUALIZACIÓN]</w:t>
+        <w:t>17 de octubre de 2026</w:t>
       </w:r>
       <w:r>
         <w:rPr>

</xml_diff>

<commit_message>
Pasa la base a PostgreSQL y renombra la marca visible a Ofixio.
Neon usa DATABASE_URL con pooler y DIRECT_URL, opcional, para migrar. El arranque aplica las migraciones y la siembra idempotente sin borrar datos. La versión legal queda en 2026-10-20.

Co-authored-by: markos.ac <markos.ac@gmail.com>
</commit_message>
<xml_diff>
--- a/docs/legal/aviso-privacidad.docx
+++ b/docs/legal/aviso-privacidad.docx
@@ -24,7 +24,7 @@
         <w:rPr>
           <w:b w:val="0"/>
         </w:rPr>
-        <w:t>Versión del texto en la aplicación: 2026-10-17</w:t>
+        <w:t>Versión del texto en la aplicación: 2026-10-20</w:t>
       </w:r>
     </w:p>
     <w:p>
@@ -32,7 +32,7 @@
         <w:rPr>
           <w:b w:val="0"/>
         </w:rPr>
-        <w:t>Fecha de última actualización: 17 de octubre de 2026</w:t>
+        <w:t>Fecha de última actualización: 20 de octubre de 2026</w:t>
       </w:r>
     </w:p>
     <w:p>
@@ -301,7 +301,7 @@
         <w:rPr>
           <w:b w:val="0"/>
         </w:rPr>
-        <w:t>La imagen de una identificación oficial y los datos que permitan reconocer rasgos biométricos sí se consideran datos que merecen el cuidado de datos sensibles. Solo se recabarían si se usa una verificación que los pida, y únicamente con tu consentimiento expreso en ese momento. Mientras esa función no pida el archivo ni el número, Oficio no los tiene.</w:t>
+        <w:t>La imagen de una identificación oficial y los datos que permitan reconocer rasgos biométricos sí se consideran datos que merecen el cuidado de datos sensibles. Solo se recabarían si se usa una verificación que los pida, y únicamente con tu consentimiento expreso en ese momento. Mientras esa función no pida el archivo ni el número, Ofixio no los tiene.</w:t>
       </w:r>
     </w:p>
     <w:p>
@@ -445,7 +445,7 @@
         <w:rPr>
           <w:b w:val="0"/>
         </w:rPr>
-        <w:t xml:space="preserve">Al registrarte hay una casilla aparte, desmarcada. Si no la marcas, estas finalidades no se aplican y puedes usar Oficio igual. Si la marcas y después cambias de opinión, escribe a </w:t>
+        <w:t xml:space="preserve">Al registrarte hay una casilla aparte, desmarcada. Si no la marcas, estas finalidades no se aplican y puedes usar Ofixio igual. Si la marcas y después cambias de opinión, escribe a </w:t>
       </w:r>
       <w:r>
         <w:rPr>
@@ -514,7 +514,7 @@
         <w:rPr>
           <w:b w:val="0"/>
         </w:rPr>
-        <w:t>OpenStreetMap, mediante el servicio Nominatim, recibe el texto de dirección o de lugar que escribes al buscar una ubicación en México, para devolver coordenadas. Oficio no controla ese servicio. La consulta lleva un identificador de la aplicación y se limita a resultados en México.</w:t>
+        <w:t>OpenStreetMap, mediante el servicio Nominatim, recibe el texto de dirección o de lugar que escribes al buscar una ubicación en México, para devolver coordenadas. Ofixio no controla ese servicio. La consulta lleva un identificador de la aplicación y se limita a resultados en México.</w:t>
       </w:r>
     </w:p>
     <w:p>
@@ -742,13 +742,13 @@
         <w:rPr>
           <w:b/>
         </w:rPr>
-        <w:t>17 de octubre de 2026</w:t>
+        <w:t>20 de octubre de 2026</w:t>
       </w:r>
       <w:r>
         <w:rPr>
           <w:b w:val="0"/>
         </w:rPr>
-        <w:t>. La versión que hoy muestra la aplicación es 2026-10-17.</w:t>
+        <w:t>. La versión que hoy muestra la aplicación es 2026-10-20.</w:t>
       </w:r>
     </w:p>
     <w:p>

</xml_diff>

<commit_message>
Cobra con Checkout Pro de Mercado Pago cuando hay token.
Sin MP_ACCESS_TOKEN el pago sigue simulado. El webhook confirma el estado en la API, y la comisión solo se parte si el proveedor conectó su cuenta.

Co-authored-by: markos.ac <markos.ac@gmail.com>
</commit_message>
<xml_diff>
--- a/docs/legal/aviso-privacidad.docx
+++ b/docs/legal/aviso-privacidad.docx
@@ -24,7 +24,7 @@
         <w:rPr>
           <w:b w:val="0"/>
         </w:rPr>
-        <w:t>Versión del texto en la aplicación: 2026-10-20</w:t>
+        <w:t>Versión del texto en la aplicación: 2026-10-20.2</w:t>
       </w:r>
     </w:p>
     <w:p>
@@ -64,7 +64,7 @@
         <w:rPr>
           <w:b w:val="0"/>
         </w:rPr>
-        <w:t>Datos que se tratan: nombre, correo, teléfono, dirección y ubicación aproximada, perfil y oficio, reseñas, mensajes del chat, datos de identificación si se usa la verificación, y el registro del medio de pago que las partes acuerdan. Hoy la aplicación no procesa pagos con tarjeta. Si se recaba la imagen o el número de una identificación oficial, ese dato se identifica como sensible en el aviso integral.</w:t>
+        <w:t>Datos que se tratan: nombre, correo, teléfono, dirección y ubicación aproximada, perfil y oficio, reseñas, mensajes del chat, datos de identificación si se usa la verificación, y el registro del pago (monto, estado e identificador de Mercado Pago). El número de tarjeta y la CLABE los captura Mercado Pago, no Ofixio. Si se recaba la imagen o el número de una identificación oficial, ese dato se identifica como sensible en el aviso integral.</w:t>
       </w:r>
     </w:p>
     <w:p>
@@ -269,7 +269,7 @@
         <w:rPr>
           <w:b w:val="0"/>
         </w:rPr>
-        <w:t>Registro del pago: medio que las partes dicen haber acordado, monto, estado y, en la demostración, una referencia simulada. No se piden ni se guardan número de tarjeta, CLABE ni credenciales bancarias. La aplicación no procesa, retiene ni garantiza dinero.</w:t>
+        <w:t>Registro del pago: medio, monto, estado, identificador que devuelve Mercado Pago y, si el proveedor conectó su cuenta, el identificador de esa cuenta. No se piden ni se guardan número de tarjeta ni CLABE: los captura Mercado Pago. Ofixio no retiene el dinero ni ofrece un depósito en garantía. Si no hay token de Mercado Pago, el registro es simulado y se marca así.</w:t>
       </w:r>
     </w:p>
     <w:p>
@@ -309,7 +309,7 @@
         <w:rPr>
           <w:b w:val="0"/>
         </w:rPr>
-        <w:t>El registro del medio de pago y del monto es un dato patrimonial. Se recaba con el consentimiento expreso de la casilla de aceptación, para la finalidad primaria de dejar constancia de lo que las partes acordaron. No es un cobro con tarjeta.</w:t>
+        <w:t>El registro del medio de pago y del monto es un dato patrimonial. Se recaba con el consentimiento expreso de la casilla de aceptación, para la finalidad primaria de operar el pago acordado. El cobro con tarjeta, OXXO o SPEI, cuando está activo, lo procesa Mercado Pago.</w:t>
       </w:r>
     </w:p>
     <w:p>
@@ -380,7 +380,7 @@
         <w:rPr>
           <w:b w:val="0"/>
         </w:rPr>
-        <w:t>Registrar el medio de pago acordado entre cliente y proveedor, sin procesar el dinero.</w:t>
+        <w:t>Registrar y, cuando Mercado Pago está configurado, iniciar el pago acordado entre cliente y proveedor. El dinero lo mueve Mercado Pago. Ofixio no lo retiene en depósito.</w:t>
       </w:r>
     </w:p>
     <w:p>
@@ -716,6 +716,17 @@
       </w:r>
     </w:p>
     <w:p>
+      <w:pPr>
+        <w:pStyle w:val="ListBullet"/>
+      </w:pPr>
+      <w:r>
+        <w:rPr>
+          <w:b w:val="0"/>
+        </w:rPr>
+        <w:t>`oficio_mp_oauth`: cookie de estado, misma protección, de unos 10 minutos, solo mientras un proveedor conecta su cuenta de Mercado Pago.</w:t>
+      </w:r>
+    </w:p>
+    <w:p>
       <w:r>
         <w:rPr>
           <w:b w:val="0"/>
@@ -748,7 +759,7 @@
         <w:rPr>
           <w:b w:val="0"/>
         </w:rPr>
-        <w:t>. La versión que hoy muestra la aplicación es 2026-10-20.</w:t>
+        <w:t>. La versión que hoy muestra la aplicación es 2026-10-20.2.</w:t>
       </w:r>
     </w:p>
     <w:p>

</xml_diff>